<commit_message>
Clarify SPS reference baseline
</commit_message>
<xml_diff>
--- a/docs/OCM-SPS-BRANCH-FILE-TRANSFER-GUIDE.docx
+++ b/docs/OCM-SPS-BRANCH-FILE-TRANSFER-GUIDE.docx
@@ -2400,11 +2400,10 @@
       <w:r>
         <w:rPr>
           <w:rFonts w:ascii="Calibri" w:hAnsi="Calibri"/>
-          <w:b w:val="0"/>
           <w:color w:val="0B2545"/>
           <w:sz w:val="22"/>
         </w:rPr>
-        <w:t>Expected reference commit for this version of the guide:</w:t>
+        <w:t>Reviewed build-content baseline:</w:t>
       </w:r>
     </w:p>
     <w:tbl>
@@ -2456,11 +2455,10 @@
       <w:r>
         <w:rPr>
           <w:rFonts w:ascii="Calibri" w:hAnsi="Calibri"/>
-          <w:b w:val="0"/>
           <w:color w:val="0B2545"/>
           <w:sz w:val="22"/>
         </w:rPr>
-        <w:t>If the reference branch has advanced, record the newer commit and review its diff before copying.</w:t>
+        <w:t>The live reference branch can be newer because documentation may be added after this baseline. Record the fetched branch SHA and review commits after the baseline before copying.</w:t>
       </w:r>
     </w:p>
     <w:p>

</xml_diff>